<commit_message>
White paper v4: catalog wave, attestation layers, pyewts cross-check, 18 suites
Co-Authored-By: Claude Opus 5 (1M context) <noreply@anthropic.com>
</commit_message>
<xml_diff>
--- a/docs/whitepaper/ALL_Translation_Tool_White_Paper.docx
+++ b/docs/whitepaper/ALL_Translation_Tool_White_Paper.docx
@@ -99,7 +99,7 @@
         <w:t xml:space="preserve"> </w:t>
       </w:r>
       <w:r>
-        <w:t xml:space="preserve">with a parallel corpus of 37,807 Tibetan–English segments drawn from</w:t>
+        <w:t xml:space="preserve">with a parallel corpus of 40,762 Tibetan–English segments drawn from</w:t>
       </w:r>
       <w:r>
         <w:t xml:space="preserve"> </w:t>
@@ -111,13 +111,25 @@
         <w:t xml:space="preserve"> </w:t>
       </w:r>
       <w:r>
-        <w:t xml:space="preserve">2026, three newly ingested published volumes: A Song of My Spiritual</w:t>
-      </w:r>
-      <w:r>
-        <w:t xml:space="preserve"> </w:t>
-      </w:r>
-      <w:r>
-        <w:t xml:space="preserve">Life, The Other Side of Emptiness, and The Sixty Verses of Nagarjuna.</w:t>
+        <w:t xml:space="preserve">2026, three newly ingested published volumes (A Song of My Spiritual</w:t>
+      </w:r>
+      <w:r>
+        <w:t xml:space="preserve"> </w:t>
+      </w:r>
+      <w:r>
+        <w:t xml:space="preserve">Life, The Other Side of Emptiness, and The Sixty Verses of Nagarjuna)</w:t>
+      </w:r>
+      <w:r>
+        <w:t xml:space="preserve"> </w:t>
+      </w:r>
+      <w:r>
+        <w:t xml:space="preserve">and nearly three thousand paired Tibetan–English titles of canonical</w:t>
+      </w:r>
+      <w:r>
+        <w:t xml:space="preserve"> </w:t>
+      </w:r>
+      <w:r>
+        <w:t xml:space="preserve">works from the Project’s own master catalogs.</w:t>
       </w:r>
     </w:p>
     <w:p>
@@ -442,43 +454,43 @@
               <w:jc w:val="left"/>
             </w:pPr>
             <w:r>
-              <w:t xml:space="preserve">37,807 aligned Tibetan–English</w:t>
+              <w:t xml:space="preserve">40,762 aligned Tibetan–English</w:t>
             </w:r>
             <w:r>
               <w:t xml:space="preserve"> </w:t>
             </w:r>
             <w:r>
-              <w:t xml:space="preserve">segments from 60+ sources and</w:t>
+              <w:t xml:space="preserve">segments from 60+ sources,</w:t>
             </w:r>
             <w:r>
               <w:t xml:space="preserve"> </w:t>
             </w:r>
             <w:r>
-              <w:t xml:space="preserve">published volumes — the evidence</w:t>
+              <w:t xml:space="preserve">published volumes, and the</w:t>
             </w:r>
             <w:r>
               <w:t xml:space="preserve"> </w:t>
             </w:r>
             <w:r>
-              <w:t xml:space="preserve">base and the</w:t>
+              <w:t xml:space="preserve">Project’s catalog titles — the</w:t>
             </w:r>
             <w:r>
               <w:t xml:space="preserve"> </w:t>
             </w:r>
             <w:r>
+              <w:t xml:space="preserve">evidence base and the</w:t>
+            </w:r>
+            <w:r>
+              <w:t xml:space="preserve"> </w:t>
+            </w:r>
+            <w:r>
               <w:t xml:space="preserve">“answer key”</w:t>
             </w:r>
             <w:r>
               <w:t xml:space="preserve"> </w:t>
             </w:r>
             <w:r>
-              <w:t xml:space="preserve">for all</w:t>
-            </w:r>
-            <w:r>
-              <w:t xml:space="preserve"> </w:t>
-            </w:r>
-            <w:r>
-              <w:t xml:space="preserve">training exercises</w:t>
+              <w:t xml:space="preserve">for all training exercises</w:t>
             </w:r>
           </w:p>
         </w:tc>
@@ -559,6 +571,62 @@
           </w:p>
         </w:tc>
       </w:tr>
+      <w:tr>
+        <w:tc>
+          <w:tcPr/>
+          <w:p>
+            <w:pPr>
+              <w:pStyle w:val="Compact"/>
+              <w:jc w:val="left"/>
+            </w:pPr>
+            <w:r>
+              <w:t xml:space="preserve">Attestation layers</w:t>
+            </w:r>
+          </w:p>
+        </w:tc>
+        <w:tc>
+          <w:tcPr/>
+          <w:p>
+            <w:pPr>
+              <w:pStyle w:val="Compact"/>
+              <w:jc w:val="left"/>
+            </w:pPr>
+            <w:r>
+              <w:t xml:space="preserve">449,000+ word forms from the Monlam</w:t>
+            </w:r>
+            <w:r>
+              <w:t xml:space="preserve"> </w:t>
+            </w:r>
+            <w:r>
+              <w:t xml:space="preserve">Grand Dictionary project and a</w:t>
+            </w:r>
+            <w:r>
+              <w:t xml:space="preserve"> </w:t>
+            </w:r>
+            <w:r>
+              <w:t xml:space="preserve">2,491-row verb-paradigm database</w:t>
+            </w:r>
+            <w:r>
+              <w:t xml:space="preserve"> </w:t>
+            </w:r>
+            <w:r>
+              <w:t xml:space="preserve">(both openly licensed) — shown</w:t>
+            </w:r>
+            <w:r>
+              <w:t xml:space="preserve"> </w:t>
+            </w:r>
+            <w:r>
+              <w:t xml:space="preserve">only as labeled reference, never</w:t>
+            </w:r>
+            <w:r>
+              <w:t xml:space="preserve"> </w:t>
+            </w:r>
+            <w:r>
+              <w:t xml:space="preserve">binding</w:t>
+            </w:r>
+          </w:p>
+        </w:tc>
+      </w:tr>
     </w:tbl>
     <w:p>
       <w:pPr>
@@ -813,7 +881,37 @@
         <w:t xml:space="preserve"> </w:t>
       </w:r>
       <w:r>
-        <w:t xml:space="preserve">suffix rules get a gentle review mark. A Display panel lets each reader</w:t>
+        <w:t xml:space="preserve">suffix rules get a gentle review mark. Even a word the dictionary does</w:t>
+      </w:r>
+      <w:r>
+        <w:t xml:space="preserve"> </w:t>
+      </w:r>
+      <w:r>
+        <w:t xml:space="preserve">not know is not left blank: it is checked against nearly half a million</w:t>
+      </w:r>
+      <w:r>
+        <w:t xml:space="preserve"> </w:t>
+      </w:r>
+      <w:r>
+        <w:t xml:space="preserve">attested word forms, so the reader learns at a glance whether it is a</w:t>
+      </w:r>
+      <w:r>
+        <w:t xml:space="preserve"> </w:t>
+      </w:r>
+      <w:r>
+        <w:t xml:space="preserve">real word awaiting an entry or a probable typo; and verbs show their</w:t>
+      </w:r>
+      <w:r>
+        <w:t xml:space="preserve"> </w:t>
+      </w:r>
+      <w:r>
+        <w:t xml:space="preserve">full tense paradigm from an openly-licensed verb database — both</w:t>
+      </w:r>
+      <w:r>
+        <w:t xml:space="preserve"> </w:t>
+      </w:r>
+      <w:r>
+        <w:t xml:space="preserve">clearly marked as reference, never as the master’s voice. A Display panel lets each reader</w:t>
       </w:r>
       <w:r>
         <w:t xml:space="preserve"> </w:t>
@@ -1324,13 +1422,19 @@
         <w:t xml:space="preserve"> </w:t>
       </w:r>
       <w:r>
-        <w:t xml:space="preserve">assembles new bibliography entries in the house format exactly, and</w:t>
-      </w:r>
-      <w:r>
-        <w:t xml:space="preserve"> </w:t>
-      </w:r>
-      <w:r>
-        <w:t xml:space="preserve">quotation detection — when the text being translated quotes a work</w:t>
+        <w:t xml:space="preserve">assembles new bibliography entries in the house format exactly —</w:t>
+      </w:r>
+      <w:r>
+        <w:t xml:space="preserve"> </w:t>
+      </w:r>
+      <w:r>
+        <w:t xml:space="preserve">filling itself in from the Project’s catalog for 1,846 known works by</w:t>
+      </w:r>
+      <w:r>
+        <w:t xml:space="preserve"> </w:t>
+      </w:r>
+      <w:r>
+        <w:t xml:space="preserve">their ACIP number — and quotation detection — when the text being translated quotes a work</w:t>
       </w:r>
       <w:r>
         <w:t xml:space="preserve"> </w:t>
@@ -1440,7 +1544,19 @@
         <w:t xml:space="preserve"> </w:t>
       </w:r>
       <w:r>
-        <w:t xml:space="preserve">index answers library-wide queries instantly. Scanned texts can be</w:t>
+        <w:t xml:space="preserve">index answers library-wide queries instantly; and a flat list view</w:t>
+      </w:r>
+      <w:r>
+        <w:t xml:space="preserve"> </w:t>
+      </w:r>
+      <w:r>
+        <w:t xml:space="preserve">lays the whole shelf out as one sortable catalog table — now showing</w:t>
+      </w:r>
+      <w:r>
+        <w:t xml:space="preserve"> </w:t>
+      </w:r>
+      <w:r>
+        <w:t xml:space="preserve">each work’s English title wherever the Project’s catalogs record one. Scanned texts can be</w:t>
       </w:r>
       <w:r>
         <w:t xml:space="preserve"> </w:t>
@@ -1869,7 +1985,7 @@
         <w:pStyle w:val="BodyText"/>
       </w:pPr>
       <w:r>
-        <w:t xml:space="preserve">The application carries sixteen automated test suites — batteries for</w:t>
+        <w:t xml:space="preserve">The application carries eighteen automated test suites — batteries for</w:t>
       </w:r>
       <w:r>
         <w:t xml:space="preserve"> </w:t>
@@ -1894,6 +2010,56 @@
       </w:r>
       <w:r>
         <w:t xml:space="preserve">mechanically, the interface says so rather than implying certainty.</w:t>
+      </w:r>
+    </w:p>
+    <w:p>
+      <w:pPr>
+        <w:pStyle w:val="BodyText"/>
+      </w:pPr>
+      <w:r>
+        <w:t xml:space="preserve">The script engine has now also been cross-examined by an outside</w:t>
+      </w:r>
+      <w:r>
+        <w:t xml:space="preserve"> </w:t>
+      </w:r>
+      <w:r>
+        <w:t xml:space="preserve">witness: an independent open-source converter, run over all 105,634</w:t>
+      </w:r>
+      <w:r>
+        <w:t xml:space="preserve"> </w:t>
+      </w:r>
+      <w:r>
+        <w:t xml:space="preserve">dictionary entries. The two agree exactly on 91.4% — and nearly every</w:t>
+      </w:r>
+      <w:r>
+        <w:t xml:space="preserve"> </w:t>
+      </w:r>
+      <w:r>
+        <w:t xml:space="preserve">disagreement is a place where this tool’s engine refuses to guess at</w:t>
+      </w:r>
+      <w:r>
+        <w:t xml:space="preserve"> </w:t>
+      </w:r>
+      <w:r>
+        <w:t xml:space="preserve">defective input while the other converts it blindly, a direct</w:t>
+      </w:r>
+      <w:r>
+        <w:t xml:space="preserve"> </w:t>
+      </w:r>
+      <w:r>
+        <w:t xml:space="preserve">vindication of the never-guess rule. The comparison also surfaced</w:t>
+      </w:r>
+      <w:r>
+        <w:t xml:space="preserve"> </w:t>
+      </w:r>
+      <w:r>
+        <w:t xml:space="preserve">thirteen genuine defects in the source data, now reported back to the</w:t>
+      </w:r>
+      <w:r>
+        <w:t xml:space="preserve"> </w:t>
+      </w:r>
+      <w:r>
+        <w:t xml:space="preserve">dictionary project for correction.</w:t>
       </w:r>
     </w:p>
     <w:p>
@@ -1916,25 +2082,31 @@
         </w:numPr>
       </w:pPr>
       <w:r>
-        <w:t xml:space="preserve">The ACIP Master Catalog: once supplied, every work in the three</w:t>
-      </w:r>
-      <w:r>
-        <w:t xml:space="preserve"> </w:t>
-      </w:r>
-      <w:r>
-        <w:t xml:space="preserve">collections carrying both a Tibetan and an English title feeds the</w:t>
-      </w:r>
-      <w:r>
-        <w:t xml:space="preserve"> </w:t>
-      </w:r>
-      <w:r>
-        <w:t xml:space="preserve">corpus and dictionary, the bibliography composer fills itself in,</w:t>
-      </w:r>
-      <w:r>
-        <w:t xml:space="preserve"> </w:t>
-      </w:r>
-      <w:r>
-        <w:t xml:space="preserve">and the Library shows every text’s English title.</w:t>
+        <w:t xml:space="preserve">The Master Catalog harvest is in: 2,955 paired titles now feed the</w:t>
+      </w:r>
+      <w:r>
+        <w:t xml:space="preserve"> </w:t>
+      </w:r>
+      <w:r>
+        <w:t xml:space="preserve">corpus, the bibliography composer fills itself in, and the Library</w:t>
+      </w:r>
+      <w:r>
+        <w:t xml:space="preserve"> </w:t>
+      </w:r>
+      <w:r>
+        <w:t xml:space="preserve">shows English titles. One ruling remains — whether the catalog’s</w:t>
+      </w:r>
+      <w:r>
+        <w:t xml:space="preserve"> </w:t>
+      </w:r>
+      <w:r>
+        <w:t xml:space="preserve">English titles stand as Geshe Michael’s own binding equivalents (he</w:t>
+      </w:r>
+      <w:r>
+        <w:t xml:space="preserve"> </w:t>
+      </w:r>
+      <w:r>
+        <w:t xml:space="preserve">directed the cataloging) or as a labeled reference layer.</w:t>
       </w:r>
     </w:p>
     <w:p>
@@ -1945,19 +2117,37 @@
         </w:numPr>
       </w:pPr>
       <w:r>
-        <w:t xml:space="preserve">The input-center formatter: converting raw input-center documents to</w:t>
-      </w:r>
-      <w:r>
-        <w:t xml:space="preserve"> </w:t>
-      </w:r>
-      <w:r>
-        <w:t xml:space="preserve">finished Tibetan Unicode, once the conversion standards document is</w:t>
-      </w:r>
-      <w:r>
-        <w:t xml:space="preserve"> </w:t>
-      </w:r>
-      <w:r>
-        <w:t xml:space="preserve">supplied.</w:t>
+        <w:t xml:space="preserve">The compilation of Geshe Michael’s translation standards continues:</w:t>
+      </w:r>
+      <w:r>
+        <w:t xml:space="preserve"> </w:t>
+      </w:r>
+      <w:r>
+        <w:t xml:space="preserve">eleven sourced standards so far, mined from the published volumes’</w:t>
+      </w:r>
+      <w:r>
+        <w:t xml:space="preserve"> </w:t>
+      </w:r>
+      <w:r>
+        <w:t xml:space="preserve">own notes and prefaces — several already running as software</w:t>
+      </w:r>
+      <w:r>
+        <w:t xml:space="preserve"> </w:t>
+      </w:r>
+      <w:r>
+        <w:t xml:space="preserve">features (the technical-spelling apparatus, italicized name-parts in</w:t>
+      </w:r>
+      <w:r>
+        <w:t xml:space="preserve"> </w:t>
+      </w:r>
+      <w:r>
+        <w:t xml:space="preserve">export) — with a prepared review sheet so proposed footnotes can be</w:t>
+      </w:r>
+      <w:r>
+        <w:t xml:space="preserve"> </w:t>
+      </w:r>
+      <w:r>
+        <w:t xml:space="preserve">approved in his own sessions, never in the software.</w:t>
       </w:r>
     </w:p>
     <w:p>
@@ -1968,13 +2158,43 @@
         </w:numPr>
       </w:pPr>
       <w:r>
-        <w:t xml:space="preserve">Embedded Tibetan OCR (BDRC’s open models, license permitting), which</w:t>
-      </w:r>
-      <w:r>
-        <w:t xml:space="preserve"> </w:t>
-      </w:r>
-      <w:r>
-        <w:t xml:space="preserve">also unlocks word-level scan following.</w:t>
+        <w:t xml:space="preserve">A completed worldwide survey of open Tibetan software and data now</w:t>
+      </w:r>
+      <w:r>
+        <w:t xml:space="preserve"> </w:t>
+      </w:r>
+      <w:r>
+        <w:t xml:space="preserve">gives the project a vetted, license-checked menu of integrations:</w:t>
+      </w:r>
+      <w:r>
+        <w:t xml:space="preserve"> </w:t>
+      </w:r>
+      <w:r>
+        <w:t xml:space="preserve">next is a proven word-segmentation engine (port under way), then a</w:t>
+      </w:r>
+      <w:r>
+        <w:t xml:space="preserve"> </w:t>
+      </w:r>
+      <w:r>
+        <w:t xml:space="preserve">classical calendar engine for dating colophons. The survey also</w:t>
+      </w:r>
+      <w:r>
+        <w:t xml:space="preserve"> </w:t>
+      </w:r>
+      <w:r>
+        <w:t xml:space="preserve">confirmed that several of this tool’s layers — the verse meter,</w:t>
+      </w:r>
+      <w:r>
+        <w:t xml:space="preserve"> </w:t>
+      </w:r>
+      <w:r>
+        <w:t xml:space="preserve">the grammar rule engine, the Science of the Dots — exist nowhere</w:t>
+      </w:r>
+      <w:r>
+        <w:t xml:space="preserve"> </w:t>
+      </w:r>
+      <w:r>
+        <w:t xml:space="preserve">else in the field.</w:t>
       </w:r>
     </w:p>
     <w:p>
@@ -1985,13 +2205,36 @@
         </w:numPr>
       </w:pPr>
       <w:r>
-        <w:t xml:space="preserve">The continuing compilation of Geshe Michael’s translation standards,</w:t>
-      </w:r>
-      <w:r>
-        <w:t xml:space="preserve"> </w:t>
-      </w:r>
-      <w:r>
-        <w:t xml:space="preserve">each integrated into the software as it is gathered.</w:t>
+        <w:t xml:space="preserve">The input-center formatter: converting raw input-center documents to</w:t>
+      </w:r>
+      <w:r>
+        <w:t xml:space="preserve"> </w:t>
+      </w:r>
+      <w:r>
+        <w:t xml:space="preserve">finished Tibetan Unicode, once the conversion standards document is</w:t>
+      </w:r>
+      <w:r>
+        <w:t xml:space="preserve"> </w:t>
+      </w:r>
+      <w:r>
+        <w:t xml:space="preserve">supplied.</w:t>
+      </w:r>
+    </w:p>
+    <w:p>
+      <w:pPr>
+        <w:numPr>
+          <w:ilvl w:val="0"/>
+          <w:numId w:val="1003"/>
+        </w:numPr>
+      </w:pPr>
+      <w:r>
+        <w:t xml:space="preserve">Embedded Tibetan OCR (BDRC’s open models, license permitting), which</w:t>
+      </w:r>
+      <w:r>
+        <w:t xml:space="preserve"> </w:t>
+      </w:r>
+      <w:r>
+        <w:t xml:space="preserve">also unlocks word-level scan following.</w:t>
       </w:r>
     </w:p>
     <w:p>

</xml_diff>

<commit_message>
White paper v5: the calendar, the affix program, the working library
Updated for Geshe Michael across every section that moved today:
corpus 42,199 (titles + subjects + authors described), the installed
2,716-text library, the calendar engine with its 822 verified fixture
points and a new 'Time itself' section, botok segmentation, the affix
program across lookup/corpus/library, and the pyewts cross-check told
honestly (91.4% exact; most divergence is our side refusing to guess).
Twenty-three suites. Both .md and .docx regenerated together.

Co-Authored-By: Claude Fable 5 <noreply@anthropic.com>
</commit_message>
<xml_diff>
--- a/docs/whitepaper/ALL_Translation_Tool_White_Paper.docx
+++ b/docs/whitepaper/ALL_Translation_Tool_White_Paper.docx
@@ -454,7 +454,7 @@
               <w:jc w:val="left"/>
             </w:pPr>
             <w:r>
-              <w:t xml:space="preserve">40,762 aligned Tibetan–English</w:t>
+              <w:t xml:space="preserve">42,199 aligned Tibetan–English</w:t>
             </w:r>
             <w:r>
               <w:t xml:space="preserve"> </w:t>
@@ -466,13 +466,25 @@
               <w:t xml:space="preserve"> </w:t>
             </w:r>
             <w:r>
-              <w:t xml:space="preserve">published volumes, and the</w:t>
+              <w:t xml:space="preserve">published volumes, the Project’s</w:t>
             </w:r>
             <w:r>
               <w:t xml:space="preserve"> </w:t>
             </w:r>
             <w:r>
-              <w:t xml:space="preserve">Project’s catalog titles — the</w:t>
+              <w:t xml:space="preserve">catalog titles, its bilingual</w:t>
+            </w:r>
+            <w:r>
+              <w:t xml:space="preserve"> </w:t>
+            </w:r>
+            <w:r>
+              <w:t xml:space="preserve">subject headings, and</w:t>
+            </w:r>
+            <w:r>
+              <w:t xml:space="preserve"> </w:t>
+            </w:r>
+            <w:r>
+              <w:t xml:space="preserve">join-verified author names — the</w:t>
             </w:r>
             <w:r>
               <w:t xml:space="preserve"> </w:t>
@@ -504,7 +516,7 @@
               <w:jc w:val="left"/>
             </w:pPr>
             <w:r>
-              <w:t xml:space="preserve">Lokesh Chandra layer</w:t>
+              <w:t xml:space="preserve">Installed text library</w:t>
             </w:r>
           </w:p>
         </w:tc>
@@ -516,13 +528,25 @@
               <w:jc w:val="left"/>
             </w:pPr>
             <w:r>
-              <w:t xml:space="preserve">79,305 Sanskrit-linked entries;</w:t>
+              <w:t xml:space="preserve">the complete ACIP Release 6</w:t>
             </w:r>
             <w:r>
               <w:t xml:space="preserve"> </w:t>
             </w:r>
             <w:r>
-              <w:t xml:space="preserve">88,973 headwords with IAST Sanskrit</w:t>
+              <w:t xml:space="preserve">corpus: 2,716 texts, 8.68 million</w:t>
+            </w:r>
+            <w:r>
+              <w:t xml:space="preserve"> </w:t>
+            </w:r>
+            <w:r>
+              <w:t xml:space="preserve">lines, fully search-indexed on</w:t>
+            </w:r>
+            <w:r>
+              <w:t xml:space="preserve"> </w:t>
+            </w:r>
+            <w:r>
+              <w:t xml:space="preserve">the user’s own machine</w:t>
             </w:r>
           </w:p>
         </w:tc>
@@ -536,7 +560,7 @@
               <w:jc w:val="left"/>
             </w:pPr>
             <w:r>
-              <w:t xml:space="preserve">Reference dictionaries</w:t>
+              <w:t xml:space="preserve">Lokesh Chandra layer</w:t>
             </w:r>
           </w:p>
         </w:tc>
@@ -548,25 +572,13 @@
               <w:jc w:val="left"/>
             </w:pPr>
             <w:r>
-              <w:t xml:space="preserve">445,772 definitions from legacy</w:t>
+              <w:t xml:space="preserve">79,305 Sanskrit-linked entries;</w:t>
             </w:r>
             <w:r>
               <w:t xml:space="preserve"> </w:t>
             </w:r>
             <w:r>
-              <w:t xml:space="preserve">tools (multi-scholar compilations),</w:t>
-            </w:r>
-            <w:r>
-              <w:t xml:space="preserve"> </w:t>
-            </w:r>
-            <w:r>
-              <w:t xml:space="preserve">kept strictly local as labeled</w:t>
-            </w:r>
-            <w:r>
-              <w:t xml:space="preserve"> </w:t>
-            </w:r>
-            <w:r>
-              <w:t xml:space="preserve">reference — never redistributed</w:t>
+              <w:t xml:space="preserve">88,973 headwords with IAST Sanskrit</w:t>
             </w:r>
           </w:p>
         </w:tc>
@@ -580,7 +592,7 @@
               <w:jc w:val="left"/>
             </w:pPr>
             <w:r>
-              <w:t xml:space="preserve">Attestation layers</w:t>
+              <w:t xml:space="preserve">Reference dictionaries</w:t>
             </w:r>
           </w:p>
         </w:tc>
@@ -592,6 +604,50 @@
               <w:jc w:val="left"/>
             </w:pPr>
             <w:r>
+              <w:t xml:space="preserve">445,772 definitions from legacy</w:t>
+            </w:r>
+            <w:r>
+              <w:t xml:space="preserve"> </w:t>
+            </w:r>
+            <w:r>
+              <w:t xml:space="preserve">tools (multi-scholar compilations),</w:t>
+            </w:r>
+            <w:r>
+              <w:t xml:space="preserve"> </w:t>
+            </w:r>
+            <w:r>
+              <w:t xml:space="preserve">kept strictly local as labeled</w:t>
+            </w:r>
+            <w:r>
+              <w:t xml:space="preserve"> </w:t>
+            </w:r>
+            <w:r>
+              <w:t xml:space="preserve">reference — never redistributed</w:t>
+            </w:r>
+          </w:p>
+        </w:tc>
+      </w:tr>
+      <w:tr>
+        <w:tc>
+          <w:tcPr/>
+          <w:p>
+            <w:pPr>
+              <w:pStyle w:val="Compact"/>
+              <w:jc w:val="left"/>
+            </w:pPr>
+            <w:r>
+              <w:t xml:space="preserve">Attestation layers</w:t>
+            </w:r>
+          </w:p>
+        </w:tc>
+        <w:tc>
+          <w:tcPr/>
+          <w:p>
+            <w:pPr>
+              <w:pStyle w:val="Compact"/>
+              <w:jc w:val="left"/>
+            </w:pPr>
+            <w:r>
               <w:t xml:space="preserve">449,000+ word forms from the Monlam</w:t>
             </w:r>
             <w:r>
@@ -824,6 +880,176 @@
     </w:p>
     <w:p>
       <w:pPr>
+        <w:numPr>
+          <w:ilvl w:val="0"/>
+          <w:numId w:val="1002"/>
+        </w:numPr>
+      </w:pPr>
+      <w:r>
+        <w:t xml:space="preserve">The Tibetan calendar: the traditional Modern Karana arithmetic —</w:t>
+      </w:r>
+      <w:r>
+        <w:t xml:space="preserve"> </w:t>
+      </w:r>
+      <w:r>
+        <w:t xml:space="preserve">true month, true weekday, true sun, and the general day count —</w:t>
+      </w:r>
+      <w:r>
+        <w:t xml:space="preserve"> </w:t>
+      </w:r>
+      <w:r>
+        <w:t xml:space="preserve">ported from Edward Henning’s authoritative open-source</w:t>
+      </w:r>
+      <w:r>
+        <w:t xml:space="preserve"> </w:t>
+      </w:r>
+      <w:r>
+        <w:t xml:space="preserve">implementation and proven against the original program running</w:t>
+      </w:r>
+      <w:r>
+        <w:t xml:space="preserve"> </w:t>
+      </w:r>
+      <w:r>
+        <w:t xml:space="preserve">beside it: 76 of 76 spot fixtures, then every month header (25/25)</w:t>
+      </w:r>
+      <w:r>
+        <w:t xml:space="preserve"> </w:t>
+      </w:r>
+      <w:r>
+        <w:t xml:space="preserve">and every day (721/721) of two complete printed years, with all 17</w:t>
+      </w:r>
+      <w:r>
+        <w:t xml:space="preserve"> </w:t>
+      </w:r>
+      <w:r>
+        <w:t xml:space="preserve">doubled lunar days verified as exact pairs. Year designations</w:t>
+      </w:r>
+      <w:r>
+        <w:t xml:space="preserve"> </w:t>
+      </w:r>
+      <w:r>
+        <w:t xml:space="preserve">(rabjung, element-animal) are computed independently and agree with</w:t>
+      </w:r>
+      <w:r>
+        <w:t xml:space="preserve"> </w:t>
+      </w:r>
+      <w:r>
+        <w:t xml:space="preserve">the ported formulas.</w:t>
+      </w:r>
+    </w:p>
+    <w:p>
+      <w:pPr>
+        <w:numPr>
+          <w:ilvl w:val="0"/>
+          <w:numId w:val="1002"/>
+        </w:numPr>
+      </w:pPr>
+      <w:r>
+        <w:t xml:space="preserve">Word segmentation: a faithful port of the openly-licensed botok</w:t>
+      </w:r>
+      <w:r>
+        <w:t xml:space="preserve"> </w:t>
+      </w:r>
+      <w:r>
+        <w:t xml:space="preserve">tokenizer (the ecosystem standard, and deterministic — a trie over</w:t>
+      </w:r>
+      <w:r>
+        <w:t xml:space="preserve"> </w:t>
+      </w:r>
+      <w:r>
+        <w:t xml:space="preserve">a lexicon, not machine learning), proven token-for-token against the</w:t>
+      </w:r>
+      <w:r>
+        <w:t xml:space="preserve"> </w:t>
+      </w:r>
+      <w:r>
+        <w:t xml:space="preserve">original across the full corpus, feeding a clearly-labeled reference</w:t>
+      </w:r>
+      <w:r>
+        <w:t xml:space="preserve"> </w:t>
+      </w:r>
+      <w:r>
+        <w:t xml:space="preserve">layer in the reading pane.</w:t>
+      </w:r>
+    </w:p>
+    <w:p>
+      <w:pPr>
+        <w:numPr>
+          <w:ilvl w:val="0"/>
+          <w:numId w:val="1002"/>
+        </w:numPr>
+      </w:pPr>
+      <w:r>
+        <w:t xml:space="preserve">Affixed-particle normalization: the rules behind the Buddhist</w:t>
+      </w:r>
+      <w:r>
+        <w:t xml:space="preserve"> </w:t>
+      </w:r>
+      <w:r>
+        <w:t xml:space="preserve">Digital Resource Center’s own search engine, ported so that a search</w:t>
+      </w:r>
+      <w:r>
+        <w:t xml:space="preserve"> </w:t>
+      </w:r>
+      <w:r>
+        <w:t xml:space="preserve">for a bare word also finds its case-built forms — everywhere: the</w:t>
+      </w:r>
+      <w:r>
+        <w:t xml:space="preserve"> </w:t>
+      </w:r>
+      <w:r>
+        <w:t xml:space="preserve">dictionary lookup, the corpus, and the installed library — while</w:t>
+      </w:r>
+      <w:r>
+        <w:t xml:space="preserve"> </w:t>
+      </w:r>
+      <w:r>
+        <w:t xml:space="preserve">words whose final letter belongs to the root are never over-stripped.</w:t>
+      </w:r>
+    </w:p>
+    <w:p>
+      <w:pPr>
+        <w:numPr>
+          <w:ilvl w:val="0"/>
+          <w:numId w:val="1002"/>
+        </w:numPr>
+      </w:pPr>
+      <w:r>
+        <w:t xml:space="preserve">An independent cross-check: the ecosystem’s standard converter was</w:t>
+      </w:r>
+      <w:r>
+        <w:t xml:space="preserve"> </w:t>
+      </w:r>
+      <w:r>
+        <w:t xml:space="preserve">run over all 105,634 dictionary entries as a diff-oracle. It agreed</w:t>
+      </w:r>
+      <w:r>
+        <w:t xml:space="preserve"> </w:t>
+      </w:r>
+      <w:r>
+        <w:t xml:space="preserve">with our engine on 91.4% exactly; nearly all the rest are entries</w:t>
+      </w:r>
+      <w:r>
+        <w:t xml:space="preserve"> </w:t>
+      </w:r>
+      <w:r>
+        <w:t xml:space="preserve">where OUR side refuses to guess (the master’s honesty flags) while</w:t>
+      </w:r>
+      <w:r>
+        <w:t xml:space="preserve"> </w:t>
+      </w:r>
+      <w:r>
+        <w:t xml:space="preserve">the other converter mangles blindly — and 13 genuine source</w:t>
+      </w:r>
+      <w:r>
+        <w:t xml:space="preserve"> </w:t>
+      </w:r>
+      <w:r>
+        <w:t xml:space="preserve">defects it exposed were filed for correction.</w:t>
+      </w:r>
+    </w:p>
+    <w:p>
+      <w:pPr>
         <w:pStyle w:val="FirstParagraph"/>
       </w:pPr>
       <w:r>
@@ -1985,7 +2211,7 @@
         <w:pStyle w:val="BodyText"/>
       </w:pPr>
       <w:r>
-        <w:t xml:space="preserve">The application carries eighteen automated test suites — batteries for</w:t>
+        <w:t xml:space="preserve">The application carries twenty-three automated test suites — batteries for</w:t>
       </w:r>
       <w:r>
         <w:t xml:space="preserve"> </w:t>
@@ -2060,6 +2286,74 @@
       </w:r>
       <w:r>
         <w:t xml:space="preserve">dictionary project for correction.</w:t>
+      </w:r>
+    </w:p>
+    <w:p>
+      <w:pPr>
+        <w:pStyle w:val="BodyText"/>
+      </w:pPr>
+      <w:r>
+        <w:rPr>
+          <w:b/>
+          <w:bCs/>
+        </w:rPr>
+        <w:t xml:space="preserve">8a. Time itself</w:t>
+      </w:r>
+    </w:p>
+    <w:p>
+      <w:pPr>
+        <w:pStyle w:val="BodyText"/>
+      </w:pPr>
+      <w:r>
+        <w:t xml:space="preserve">The Convert pane now answers the translator’s dating questions in</w:t>
+      </w:r>
+      <w:r>
+        <w:t xml:space="preserve"> </w:t>
+      </w:r>
+      <w:r>
+        <w:t xml:space="preserve">every direction: a western year yields its full Tibetan designation</w:t>
+      </w:r>
+      <w:r>
+        <w:t xml:space="preserve"> </w:t>
+      </w:r>
+      <w:r>
+        <w:t xml:space="preserve">(element, animal, rabjung cycle); an element-animal pair yields its</w:t>
+      </w:r>
+      <w:r>
+        <w:t xml:space="preserve"> </w:t>
+      </w:r>
+      <w:r>
+        <w:t xml:space="preserve">years; a full Tibetan date (lunar day, month, year) yields the western</w:t>
+      </w:r>
+      <w:r>
+        <w:t xml:space="preserve"> </w:t>
+      </w:r>
+      <w:r>
+        <w:t xml:space="preserve">weekday and date — and the reverse — with the calendar’s own</w:t>
+      </w:r>
+      <w:r>
+        <w:t xml:space="preserve"> </w:t>
+      </w:r>
+      <w:r>
+        <w:t xml:space="preserve">irregularities honored rather than smoothed: doubled and omitted lunar</w:t>
+      </w:r>
+      <w:r>
+        <w:t xml:space="preserve"> </w:t>
+      </w:r>
+      <w:r>
+        <w:t xml:space="preserve">days are named as such, intercalary months appear in their correct</w:t>
+      </w:r>
+      <w:r>
+        <w:t xml:space="preserve"> </w:t>
+      </w:r>
+      <w:r>
+        <w:t xml:space="preserve">place with their correct names, and dates before the epoch are refused</w:t>
+      </w:r>
+      <w:r>
+        <w:t xml:space="preserve"> </w:t>
+      </w:r>
+      <w:r>
+        <w:t xml:space="preserve">rather than approximated.</w:t>
       </w:r>
     </w:p>
     <w:p>

</xml_diff>

<commit_message>
White paper v7: the August-8 era
Everything since v6, in the established voice: embedded OCR (Scan
pane, BDRC models with permission, word-level positions), the Align
pane (Hypercontext reborn, .hyp import), the Input pane (the ACE
lineage recovered and rebuilt — typing beside the scan, folio
markers, double-keying), the Overlay's word-locate on woodblocks, the
Whitney layer (both preeminent works), the scholarly reference layers
row, the Project's own registers (community pronunciations, the
kamdir prenasal rule, honorifics), the legacy-font rescue lane, the
Lookup enrichments, fourteen panes, thirty-six suites, two
independent converter witnesses, and the refreshed road ahead
(registers under review, input-center formatter, cataloging set aside
as its own future project). docx regenerated via pandoc.

Co-Authored-By: Claude Fable 5 <noreply@anthropic.com>
</commit_message>
<xml_diff>
--- a/docs/whitepaper/ALL_Translation_Tool_White_Paper.docx
+++ b/docs/whitepaper/ALL_Translation_Tool_White_Paper.docx
@@ -37,7 +37,7 @@
         <w:t xml:space="preserve"> </w:t>
       </w:r>
       <w:r>
-        <w:t xml:space="preserve">August 2026</w:t>
+        <w:t xml:space="preserve">August 2026 (v7)</w:t>
       </w:r>
     </w:p>
     <w:p>
@@ -719,6 +719,193 @@
           </w:p>
         </w:tc>
       </w:tr>
+      <w:tr>
+        <w:tc>
+          <w:tcPr/>
+          <w:p>
+            <w:pPr>
+              <w:pStyle w:val="Compact"/>
+              <w:jc w:val="left"/>
+            </w:pPr>
+            <w:r>
+              <w:t xml:space="preserve">Scholarly reference layers</w:t>
+            </w:r>
+          </w:p>
+        </w:tc>
+        <w:tc>
+          <w:tcPr/>
+          <w:p>
+            <w:pPr>
+              <w:pStyle w:val="Compact"/>
+              <w:jc w:val="left"/>
+            </w:pPr>
+            <w:r>
+              <w:t xml:space="preserve">the Mahāvyutpatti (9,379 classical</w:t>
+            </w:r>
+            <w:r>
+              <w:t xml:space="preserve"> </w:t>
+            </w:r>
+            <w:r>
+              <w:t xml:space="preserve">Sanskrit–Tibetan equivalences);</w:t>
+            </w:r>
+            <w:r>
+              <w:t xml:space="preserve"> </w:t>
+            </w:r>
+            <w:r>
+              <w:t xml:space="preserve">a hand-tagged classical</w:t>
+            </w:r>
+            <w:r>
+              <w:t xml:space="preserve"> </w:t>
+            </w:r>
+            <w:r>
+              <w:t xml:space="preserve">part-of-speech lexicon (13,107</w:t>
+            </w:r>
+            <w:r>
+              <w:t xml:space="preserve"> </w:t>
+            </w:r>
+            <w:r>
+              <w:t xml:space="preserve">forms); a manuscript-abbreviation</w:t>
+            </w:r>
+            <w:r>
+              <w:t xml:space="preserve"> </w:t>
+            </w:r>
+            <w:r>
+              <w:t xml:space="preserve">table; and William Dwight</w:t>
+            </w:r>
+            <w:r>
+              <w:t xml:space="preserve"> </w:t>
+            </w:r>
+            <w:r>
+              <w:t xml:space="preserve">Whitney’s two preeminent Sanskrit</w:t>
+            </w:r>
+            <w:r>
+              <w:t xml:space="preserve"> </w:t>
+            </w:r>
+            <w:r>
+              <w:t xml:space="preserve">works — all 937 roots of the</w:t>
+            </w:r>
+            <w:r>
+              <w:t xml:space="preserve"> </w:t>
+            </w:r>
+            <w:r>
+              <w:t xml:space="preserve">1885 Roots with per-root section</w:t>
+            </w:r>
+            <w:r>
+              <w:t xml:space="preserve"> </w:t>
+            </w:r>
+            <w:r>
+              <w:t xml:space="preserve">citations into the 1879 Grammar</w:t>
+            </w:r>
+            <w:r>
+              <w:t xml:space="preserve"> </w:t>
+            </w:r>
+            <w:r>
+              <w:t xml:space="preserve">— every layer license-verified</w:t>
+            </w:r>
+            <w:r>
+              <w:t xml:space="preserve"> </w:t>
+            </w:r>
+            <w:r>
+              <w:t xml:space="preserve">and clearly labeled comparanda</w:t>
+            </w:r>
+          </w:p>
+        </w:tc>
+      </w:tr>
+      <w:tr>
+        <w:tc>
+          <w:tcPr/>
+          <w:p>
+            <w:pPr>
+              <w:pStyle w:val="Compact"/>
+              <w:jc w:val="left"/>
+            </w:pPr>
+            <w:r>
+              <w:t xml:space="preserve">The Project’s own registers</w:t>
+            </w:r>
+          </w:p>
+        </w:tc>
+        <w:tc>
+          <w:tcPr/>
+          <w:p>
+            <w:pPr>
+              <w:pStyle w:val="Compact"/>
+              <w:jc w:val="left"/>
+            </w:pPr>
+            <w:r>
+              <w:t xml:space="preserve">a growing register of community</w:t>
+            </w:r>
+            <w:r>
+              <w:t xml:space="preserve"> </w:t>
+            </w:r>
+            <w:r>
+              <w:t xml:space="preserve">pronunciations (gonpa, tulku,</w:t>
+            </w:r>
+            <w:r>
+              <w:t xml:space="preserve"> </w:t>
+            </w:r>
+            <w:r>
+              <w:t xml:space="preserve">chenrezig…) beside the strict</w:t>
+            </w:r>
+            <w:r>
+              <w:t xml:space="preserve"> </w:t>
+            </w:r>
+            <w:r>
+              <w:t xml:space="preserve">convention; the prenasal rule</w:t>
+            </w:r>
+            <w:r>
+              <w:t xml:space="preserve"> </w:t>
+            </w:r>
+            <w:r>
+              <w:t xml:space="preserve">Geshe Michael teaches (SKABS ’DIR</w:t>
+            </w:r>
+            <w:r>
+              <w:t xml:space="preserve"> </w:t>
+            </w:r>
+            <w:r>
+              <w:t xml:space="preserve">spoken</w:t>
+            </w:r>
+            <w:r>
+              <w:t xml:space="preserve"> </w:t>
+            </w:r>
+            <w:r>
+              <w:t xml:space="preserve">“kamdir”</w:t>
+            </w:r>
+            <w:r>
+              <w:t xml:space="preserve">) applied across</w:t>
+            </w:r>
+            <w:r>
+              <w:t xml:space="preserve"> </w:t>
+            </w:r>
+            <w:r>
+              <w:t xml:space="preserve">the dictionary as a derived,</w:t>
+            </w:r>
+            <w:r>
+              <w:t xml:space="preserve"> </w:t>
+            </w:r>
+            <w:r>
+              <w:t xml:space="preserve">review-pending class; and an</w:t>
+            </w:r>
+            <w:r>
+              <w:t xml:space="preserve"> </w:t>
+            </w:r>
+            <w:r>
+              <w:t xml:space="preserve">honorific (zhe sa) register with</w:t>
+            </w:r>
+            <w:r>
+              <w:t xml:space="preserve"> </w:t>
+            </w:r>
+            <w:r>
+              <w:t xml:space="preserve">a high-honorific level awaiting</w:t>
+            </w:r>
+            <w:r>
+              <w:t xml:space="preserve"> </w:t>
+            </w:r>
+            <w:r>
+              <w:t xml:space="preserve">his marking</w:t>
+            </w:r>
+          </w:p>
+        </w:tc>
+      </w:tr>
     </w:tbl>
     <w:p>
       <w:pPr>
@@ -1093,7 +1280,7 @@
           <w:b/>
           <w:bCs/>
         </w:rPr>
-        <w:t xml:space="preserve">5. A tour of the nine panes</w:t>
+        <w:t xml:space="preserve">5. A tour of the fourteen panes</w:t>
       </w:r>
     </w:p>
     <w:p>
@@ -1347,7 +1534,31 @@
         <w:t xml:space="preserve"> </w:t>
       </w:r>
       <w:r>
-        <w:t xml:space="preserve">remembered.</w:t>
+        <w:t xml:space="preserve">remembered. And the following now reaches the single word: an opt-in</w:t>
+      </w:r>
+      <w:r>
+        <w:t xml:space="preserve"> </w:t>
+      </w:r>
+      <w:r>
+        <w:t xml:space="preserve">button reads the woodblock image itself with the embedded text</w:t>
+      </w:r>
+      <w:r>
+        <w:t xml:space="preserve"> </w:t>
+      </w:r>
+      <w:r>
+        <w:t xml:space="preserve">recognition described below and draws a box around the very word under</w:t>
+      </w:r>
+      <w:r>
+        <w:t xml:space="preserve"> </w:t>
+      </w:r>
+      <w:r>
+        <w:t xml:space="preserve">the cursor — the recognition is used only to locate, never as text,</w:t>
+      </w:r>
+      <w:r>
+        <w:t xml:space="preserve"> </w:t>
+      </w:r>
+      <w:r>
+        <w:t xml:space="preserve">and when it cannot find the word it says so.</w:t>
       </w:r>
     </w:p>
     <w:p>
@@ -1818,43 +2029,271 @@
         <w:t xml:space="preserve"> </w:t>
       </w:r>
       <w:r>
-        <w:t xml:space="preserve">each work’s English title wherever the Project’s catalogs record one. Scanned texts can be</w:t>
-      </w:r>
-      <w:r>
-        <w:t xml:space="preserve"> </w:t>
-      </w:r>
-      <w:r>
-        <w:t xml:space="preserve">handed to BDRC’s free Tibetan OCR application, and anything that comes</w:t>
-      </w:r>
-      <w:r>
-        <w:t xml:space="preserve"> </w:t>
-      </w:r>
-      <w:r>
-        <w:t xml:space="preserve">back is treated with the Project’s own discipline: OCR output is</w:t>
-      </w:r>
-      <w:r>
-        <w:t xml:space="preserve"> </w:t>
-      </w:r>
-      <w:r>
-        <w:t xml:space="preserve">tagged as unverified review material, and opening it runs an immediate</w:t>
-      </w:r>
-      <w:r>
-        <w:t xml:space="preserve"> </w:t>
-      </w:r>
-      <w:r>
-        <w:t xml:space="preserve">first-pass quality check that counts and marks every syllable failing</w:t>
-      </w:r>
-      <w:r>
-        <w:t xml:space="preserve"> </w:t>
-      </w:r>
-      <w:r>
-        <w:t xml:space="preserve">the classical legality rules — nothing is smoothed, everything is</w:t>
-      </w:r>
-      <w:r>
-        <w:t xml:space="preserve"> </w:t>
-      </w:r>
-      <w:r>
-        <w:t xml:space="preserve">flagged.</w:t>
+        <w:t xml:space="preserve">each work’s English title wherever the Project’s catalogs record one. A</w:t>
+      </w:r>
+      <w:r>
+        <w:t xml:space="preserve"> </w:t>
+      </w:r>
+      <w:r>
+        <w:t xml:space="preserve">legacy-font rescue lane converts documents typed in the pre-Unicode</w:t>
+      </w:r>
+      <w:r>
+        <w:t xml:space="preserve"> </w:t>
+      </w:r>
+      <w:r>
+        <w:t xml:space="preserve">Tibetan fonts (TibetanMachineWeb, Sambhota and their kin) to proper</w:t>
+      </w:r>
+      <w:r>
+        <w:t xml:space="preserve"> </w:t>
+      </w:r>
+      <w:r>
+        <w:t xml:space="preserve">Unicode through the Trace Foundation’s converter, run as a separate</w:t>
+      </w:r>
+      <w:r>
+        <w:t xml:space="preserve"> </w:t>
+      </w:r>
+      <w:r>
+        <w:t xml:space="preserve">external tool and honestly labeled.</w:t>
+      </w:r>
+    </w:p>
+    <w:p>
+      <w:pPr>
+        <w:pStyle w:val="BodyText"/>
+      </w:pPr>
+      <w:r>
+        <w:rPr>
+          <w:b/>
+          <w:bCs/>
+        </w:rPr>
+        <w:t xml:space="preserve">Scan — Tibetan OCR, embedded and proven</w:t>
+      </w:r>
+    </w:p>
+    <w:p>
+      <w:pPr>
+        <w:pStyle w:val="BodyText"/>
+      </w:pPr>
+      <w:r>
+        <w:t xml:space="preserve">Text recognition now lives inside the application: the Buddhist</w:t>
+      </w:r>
+      <w:r>
+        <w:t xml:space="preserve"> </w:t>
+      </w:r>
+      <w:r>
+        <w:t xml:space="preserve">Digital Resource Center’s open models (used with BDRC’s permission,</w:t>
+      </w:r>
+      <w:r>
+        <w:t xml:space="preserve"> </w:t>
+      </w:r>
+      <w:r>
+        <w:t xml:space="preserve">and credited wherever output appears) run locally, line detection and</w:t>
+      </w:r>
+      <w:r>
+        <w:t xml:space="preserve"> </w:t>
+      </w:r>
+      <w:r>
+        <w:t xml:space="preserve">recognition both proven line-for-line against BDRC’s own program</w:t>
+      </w:r>
+      <w:r>
+        <w:t xml:space="preserve"> </w:t>
+      </w:r>
+      <w:r>
+        <w:t xml:space="preserve">running beside them. A page scan opens, its lines are found and read,</w:t>
+      </w:r>
+      <w:r>
+        <w:t xml:space="preserve"> </w:t>
+      </w:r>
+      <w:r>
+        <w:t xml:space="preserve">and every recognized line is shown in transliteration and Tibetan</w:t>
+      </w:r>
+      <w:r>
+        <w:t xml:space="preserve"> </w:t>
+      </w:r>
+      <w:r>
+        <w:t xml:space="preserve">script with an immediate first-pass quality check that counts and</w:t>
+      </w:r>
+      <w:r>
+        <w:t xml:space="preserve"> </w:t>
+      </w:r>
+      <w:r>
+        <w:t xml:space="preserve">marks every syllable failing the classical legality rules — nothing</w:t>
+      </w:r>
+      <w:r>
+        <w:t xml:space="preserve"> </w:t>
+      </w:r>
+      <w:r>
+        <w:t xml:space="preserve">is smoothed, everything is flagged, and all output is tagged</w:t>
+      </w:r>
+      <w:r>
+        <w:t xml:space="preserve"> </w:t>
+      </w:r>
+      <w:r>
+        <w:t xml:space="preserve">unverified review material that never enters the corpus. A whole</w:t>
+      </w:r>
+      <w:r>
+        <w:t xml:space="preserve"> </w:t>
+      </w:r>
+      <w:r>
+        <w:t xml:space="preserve">folder of page scans — a scanned volume — processes in one batch.</w:t>
+      </w:r>
+      <w:r>
+        <w:t xml:space="preserve"> </w:t>
+      </w:r>
+      <w:r>
+        <w:t xml:space="preserve">Every recognized word carries its exact position on the page, so</w:t>
+      </w:r>
+      <w:r>
+        <w:t xml:space="preserve"> </w:t>
+      </w:r>
+      <w:r>
+        <w:t xml:space="preserve">clicking a word in the reading lights it up on the woodblock.</w:t>
+      </w:r>
+    </w:p>
+    <w:p>
+      <w:pPr>
+        <w:pStyle w:val="BodyText"/>
+      </w:pPr>
+      <w:r>
+        <w:rPr>
+          <w:b/>
+          <w:bCs/>
+        </w:rPr>
+        <w:t xml:space="preserve">Align — the Hypercontext workflow, reborn</w:t>
+      </w:r>
+    </w:p>
+    <w:p>
+      <w:pPr>
+        <w:pStyle w:val="BodyText"/>
+      </w:pPr>
+      <w:r>
+        <w:t xml:space="preserve">The Project’s original Hypercontext tool — the program whose</w:t>
+      </w:r>
+      <w:r>
+        <w:t xml:space="preserve"> </w:t>
+      </w:r>
+      <w:r>
+        <w:t xml:space="preserve">hypertexted files fed the first dictionary building — lives again:</w:t>
+      </w:r>
+      <w:r>
+        <w:t xml:space="preserve"> </w:t>
+      </w:r>
+      <w:r>
+        <w:t xml:space="preserve">click a Tibetan word (the word-finder cycles through the possible</w:t>
+      </w:r>
+      <w:r>
+        <w:t xml:space="preserve"> </w:t>
+      </w:r>
+      <w:r>
+        <w:t xml:space="preserve">lengths), select its English, press space, and the pair is linked;</w:t>
+      </w:r>
+      <w:r>
+        <w:t xml:space="preserve"> </w:t>
+      </w:r>
+      <w:r>
+        <w:t xml:space="preserve">sublinks nest inside longer links in their own color. Links save per</w:t>
+      </w:r>
+      <w:r>
+        <w:t xml:space="preserve"> </w:t>
+      </w:r>
+      <w:r>
+        <w:t xml:space="preserve">text, and the harvest exports as clearly-PENDING candidate pairs for</w:t>
+      </w:r>
+      <w:r>
+        <w:t xml:space="preserve"> </w:t>
+      </w:r>
+      <w:r>
+        <w:t xml:space="preserve">the dictionary project — translator-authored attestations, never</w:t>
+      </w:r>
+      <w:r>
+        <w:t xml:space="preserve"> </w:t>
+      </w:r>
+      <w:r>
+        <w:t xml:space="preserve">auto-ingested. Legacy .hyp files from the original era import</w:t>
+      </w:r>
+      <w:r>
+        <w:t xml:space="preserve"> </w:t>
+      </w:r>
+      <w:r>
+        <w:t xml:space="preserve">directly, proven against the original tutorial file itself.</w:t>
+      </w:r>
+    </w:p>
+    <w:p>
+      <w:pPr>
+        <w:pStyle w:val="BodyText"/>
+      </w:pPr>
+      <w:r>
+        <w:rPr>
+          <w:b/>
+          <w:bCs/>
+        </w:rPr>
+        <w:t xml:space="preserve">Input — the input-center workstation</w:t>
+      </w:r>
+    </w:p>
+    <w:p>
+      <w:pPr>
+        <w:pStyle w:val="BodyText"/>
+      </w:pPr>
+      <w:r>
+        <w:t xml:space="preserve">The software the input centers were meant to have — the ACE lineage,</w:t>
+      </w:r>
+      <w:r>
+        <w:t xml:space="preserve"> </w:t>
+      </w:r>
+      <w:r>
+        <w:t xml:space="preserve">recovered from its original author and rebuilt — is now a pane: the</w:t>
+      </w:r>
+      <w:r>
+        <w:t xml:space="preserve"> </w:t>
+      </w:r>
+      <w:r>
+        <w:t xml:space="preserve">page scan above, the typing area below, and the scan follows the</w:t>
+      </w:r>
+      <w:r>
+        <w:t xml:space="preserve"> </w:t>
+      </w:r>
+      <w:r>
+        <w:t xml:space="preserve">typist’s cursor line by line (exactly, when the line detector has run;</w:t>
+      </w:r>
+      <w:r>
+        <w:t xml:space="preserve"> </w:t>
+      </w:r>
+      <w:r>
+        <w:t xml:space="preserve">approximately, in the original program’s manner, when it has not).</w:t>
+      </w:r>
+      <w:r>
+        <w:t xml:space="preserve"> </w:t>
+      </w:r>
+      <w:r>
+        <w:t xml:space="preserve">Illegal syllables underline in red as they are typed; a folio-marker</w:t>
+      </w:r>
+      <w:r>
+        <w:t xml:space="preserve"> </w:t>
+      </w:r>
+      <w:r>
+        <w:t xml:space="preserve">button inserts the next @-marker per the Project’s own specification;</w:t>
+      </w:r>
+      <w:r>
+        <w:t xml:space="preserve"> </w:t>
+      </w:r>
+      <w:r>
+        <w:t xml:space="preserve">and the double-keying discipline is built in — compare your file</w:t>
+      </w:r>
+      <w:r>
+        <w:t xml:space="preserve"> </w:t>
+      </w:r>
+      <w:r>
+        <w:t xml:space="preserve">against your partner’s and every discrepancy lights up, to be</w:t>
+      </w:r>
+      <w:r>
+        <w:t xml:space="preserve"> </w:t>
+      </w:r>
+      <w:r>
+        <w:t xml:space="preserve">corrected until the two files match exactly, which has always been</w:t>
+      </w:r>
+      <w:r>
+        <w:t xml:space="preserve"> </w:t>
+      </w:r>
+      <w:r>
+        <w:t xml:space="preserve">the rule.</w:t>
       </w:r>
     </w:p>
     <w:p>
@@ -1950,7 +2389,81 @@
         <w:t xml:space="preserve"> </w:t>
       </w:r>
       <w:r>
-        <w:t xml:space="preserve">layers, and English-to-Tibetan reverse lookup.</w:t>
+        <w:t xml:space="preserve">layers, and English-to-Tibetan reverse lookup — and the search meets</w:t>
+      </w:r>
+      <w:r>
+        <w:t xml:space="preserve"> </w:t>
+      </w:r>
+      <w:r>
+        <w:t xml:space="preserve">the searcher halfway: a community spelling like</w:t>
+      </w:r>
+      <w:r>
+        <w:t xml:space="preserve"> </w:t>
+      </w:r>
+      <w:r>
+        <w:rPr>
+          <w:i/>
+          <w:iCs/>
+        </w:rPr>
+        <w:t xml:space="preserve">gonpa</w:t>
+      </w:r>
+      <w:r>
+        <w:t xml:space="preserve"> </w:t>
+      </w:r>
+      <w:r>
+        <w:t xml:space="preserve">or</w:t>
+      </w:r>
+      <w:r>
+        <w:t xml:space="preserve"> </w:t>
+      </w:r>
+      <w:r>
+        <w:rPr>
+          <w:i/>
+          <w:iCs/>
+        </w:rPr>
+        <w:t xml:space="preserve">tulku</w:t>
+      </w:r>
+      <w:r>
+        <w:t xml:space="preserve"> </w:t>
+      </w:r>
+      <w:r>
+        <w:t xml:space="preserve">finds the entry (labeled as the colloquial register’s work, with the</w:t>
+      </w:r>
+      <w:r>
+        <w:t xml:space="preserve"> </w:t>
+      </w:r>
+      <w:r>
+        <w:t xml:space="preserve">strict convention shown beside it); honorific terms wear their zhe-sa</w:t>
+      </w:r>
+      <w:r>
+        <w:t xml:space="preserve"> </w:t>
+      </w:r>
+      <w:r>
+        <w:t xml:space="preserve">badge with the ordinary word as cross-reference; a Sanskrit root or</w:t>
+      </w:r>
+      <w:r>
+        <w:t xml:space="preserve"> </w:t>
+      </w:r>
+      <w:r>
+        <w:t xml:space="preserve">even its past participle opens Whitney’s entry with his meanings, verb</w:t>
+      </w:r>
+      <w:r>
+        <w:t xml:space="preserve"> </w:t>
+      </w:r>
+      <w:r>
+        <w:t xml:space="preserve">classes, and the exact sections of his Grammar — one click reaching</w:t>
+      </w:r>
+      <w:r>
+        <w:t xml:space="preserve"> </w:t>
+      </w:r>
+      <w:r>
+        <w:t xml:space="preserve">the public-domain scan of the Grammar itself or the corresponding</w:t>
+      </w:r>
+      <w:r>
+        <w:t xml:space="preserve"> </w:t>
+      </w:r>
+      <w:r>
+        <w:t xml:space="preserve">Monier-Williams entry.</w:t>
       </w:r>
     </w:p>
     <w:p>
@@ -2247,13 +2760,13 @@
         <w:pStyle w:val="BodyText"/>
       </w:pPr>
       <w:r>
-        <w:t xml:space="preserve">The application carries twenty-three automated test suites — batteries for</w:t>
-      </w:r>
-      <w:r>
-        <w:t xml:space="preserve"> </w:t>
-      </w:r>
-      <w:r>
-        <w:t xml:space="preserve">every engine, grammar calibrations against the full corpus,</w:t>
+        <w:t xml:space="preserve">The application carries thirty-six automated test suites — batteries</w:t>
+      </w:r>
+      <w:r>
+        <w:t xml:space="preserve"> </w:t>
+      </w:r>
+      <w:r>
+        <w:t xml:space="preserve">for every engine, grammar calibrations against the full corpus,</w:t>
       </w:r>
       <w:r>
         <w:t xml:space="preserve"> </w:t>
@@ -2279,19 +2792,31 @@
         <w:pStyle w:val="BodyText"/>
       </w:pPr>
       <w:r>
-        <w:t xml:space="preserve">The script engine has now also been cross-examined by an outside</w:t>
-      </w:r>
-      <w:r>
-        <w:t xml:space="preserve"> </w:t>
-      </w:r>
-      <w:r>
-        <w:t xml:space="preserve">witness: an independent open-source converter, run over all 105,634</w:t>
-      </w:r>
-      <w:r>
-        <w:t xml:space="preserve"> </w:t>
-      </w:r>
-      <w:r>
-        <w:t xml:space="preserve">dictionary entries. The two agree exactly on 91.4% — and nearly every</w:t>
+        <w:t xml:space="preserve">The script engine has now also been cross-examined by two outside</w:t>
+      </w:r>
+      <w:r>
+        <w:t xml:space="preserve"> </w:t>
+      </w:r>
+      <w:r>
+        <w:t xml:space="preserve">witnesses: two independent open-source converters — the ecosystem’s</w:t>
+      </w:r>
+      <w:r>
+        <w:t xml:space="preserve"> </w:t>
+      </w:r>
+      <w:r>
+        <w:t xml:space="preserve">Python standard and the reference implementation the whole field</w:t>
+      </w:r>
+      <w:r>
+        <w:t xml:space="preserve"> </w:t>
+      </w:r>
+      <w:r>
+        <w:t xml:space="preserve">descends from — each run over all 105,634 dictionary entries, and</w:t>
+      </w:r>
+      <w:r>
+        <w:t xml:space="preserve"> </w:t>
+      </w:r>
+      <w:r>
+        <w:t xml:space="preserve">agreeing with each other to within three hundredths of a percent. The two agree exactly on 91.4% — and nearly every</w:t>
       </w:r>
       <w:r>
         <w:t xml:space="preserve"> </w:t>
@@ -2488,43 +3013,25 @@
         </w:numPr>
       </w:pPr>
       <w:r>
-        <w:t xml:space="preserve">A completed worldwide survey of open Tibetan software and data now</w:t>
-      </w:r>
-      <w:r>
-        <w:t xml:space="preserve"> </w:t>
-      </w:r>
-      <w:r>
-        <w:t xml:space="preserve">gives the project a vetted, license-checked menu of integrations:</w:t>
-      </w:r>
-      <w:r>
-        <w:t xml:space="preserve"> </w:t>
-      </w:r>
-      <w:r>
-        <w:t xml:space="preserve">next is a proven word-segmentation engine (port under way), then a</w:t>
-      </w:r>
-      <w:r>
-        <w:t xml:space="preserve"> </w:t>
-      </w:r>
-      <w:r>
-        <w:t xml:space="preserve">classical calendar engine for dating colophons. The survey also</w:t>
-      </w:r>
-      <w:r>
-        <w:t xml:space="preserve"> </w:t>
-      </w:r>
-      <w:r>
-        <w:t xml:space="preserve">confirmed that several of this tool’s layers — the verse meter,</w:t>
-      </w:r>
-      <w:r>
-        <w:t xml:space="preserve"> </w:t>
-      </w:r>
-      <w:r>
-        <w:t xml:space="preserve">the grammar rule engine, the Science of the Dots — exist nowhere</w:t>
-      </w:r>
-      <w:r>
-        <w:t xml:space="preserve"> </w:t>
-      </w:r>
-      <w:r>
-        <w:t xml:space="preserve">else in the field.</w:t>
+        <w:t xml:space="preserve">The registers grow under review: the prenasal pronunciation class</w:t>
+      </w:r>
+      <w:r>
+        <w:t xml:space="preserve"> </w:t>
+      </w:r>
+      <w:r>
+        <w:t xml:space="preserve">(206 derived forms awaiting Geshe Michael’s confirmation), the</w:t>
+      </w:r>
+      <w:r>
+        <w:t xml:space="preserve"> </w:t>
+      </w:r>
+      <w:r>
+        <w:t xml:space="preserve">honorific register’s high-honorific markings, and the reference</w:t>
+      </w:r>
+      <w:r>
+        <w:t xml:space="preserve"> </w:t>
+      </w:r>
+      <w:r>
+        <w:t xml:space="preserve">books on honorific usage and grammar now being gathered.</w:t>
       </w:r>
     </w:p>
     <w:p>
@@ -2547,7 +3054,13 @@
         <w:t xml:space="preserve"> </w:t>
       </w:r>
       <w:r>
-        <w:t xml:space="preserve">supplied.</w:t>
+        <w:t xml:space="preserve">supplied — with the new Input pane already carrying the typing,</w:t>
+      </w:r>
+      <w:r>
+        <w:t xml:space="preserve"> </w:t>
+      </w:r>
+      <w:r>
+        <w:t xml:space="preserve">checking, and double-keying half of that workflow.</w:t>
       </w:r>
     </w:p>
     <w:p>
@@ -2558,13 +3071,19 @@
         </w:numPr>
       </w:pPr>
       <w:r>
-        <w:t xml:space="preserve">Embedded Tibetan OCR (BDRC’s open models, license permitting), which</w:t>
-      </w:r>
-      <w:r>
-        <w:t xml:space="preserve"> </w:t>
-      </w:r>
-      <w:r>
-        <w:t xml:space="preserve">also unlocks word-level scan following.</w:t>
+        <w:t xml:space="preserve">Cataloging has been deliberately set aside as its own future</w:t>
+      </w:r>
+      <w:r>
+        <w:t xml:space="preserve"> </w:t>
+      </w:r>
+      <w:r>
+        <w:t xml:space="preserve">project; the knowledge mined from the Project’s original cataloging</w:t>
+      </w:r>
+      <w:r>
+        <w:t xml:space="preserve"> </w:t>
+      </w:r>
+      <w:r>
+        <w:t xml:space="preserve">toolchain is banked and waiting for it.</w:t>
       </w:r>
     </w:p>
     <w:p>

</xml_diff>

<commit_message>
White paper v8: the registers complete
The Project's-own-registers row brought to the day's final state: the
prenasal class complete at 206 derived forms with the consistency
finding stated for Geshe Michael's review — the derived forms never
contradict the dictionary's own attested pronunciations, which are
internally consistent at every such juncture — and the honorific
badge now described as present in every pane. docx regenerated.

Co-Authored-By: Claude Fable 5 <noreply@anthropic.com>
</commit_message>
<xml_diff>
--- a/docs/whitepaper/ALL_Translation_Tool_White_Paper.docx
+++ b/docs/whitepaper/ALL_Translation_Tool_White_Paper.docx
@@ -37,7 +37,7 @@
         <w:t xml:space="preserve"> </w:t>
       </w:r>
       <w:r>
-        <w:t xml:space="preserve">August 2026 (v7)</w:t>
+        <w:t xml:space="preserve">August 2026 (v8)</w:t>
       </w:r>
     </w:p>
     <w:p>
@@ -883,25 +883,73 @@
               <w:t xml:space="preserve"> </w:t>
             </w:r>
             <w:r>
-              <w:t xml:space="preserve">review-pending class; and an</w:t>
-            </w:r>
-            <w:r>
-              <w:t xml:space="preserve"> </w:t>
-            </w:r>
-            <w:r>
-              <w:t xml:space="preserve">honorific (zhe sa) register with</w:t>
-            </w:r>
-            <w:r>
-              <w:t xml:space="preserve"> </w:t>
-            </w:r>
-            <w:r>
-              <w:t xml:space="preserve">a high-honorific level awaiting</w:t>
-            </w:r>
-            <w:r>
-              <w:t xml:space="preserve"> </w:t>
-            </w:r>
-            <w:r>
-              <w:t xml:space="preserve">his marking</w:t>
+              <w:t xml:space="preserve">review-pending class of 206 forms</w:t>
+            </w:r>
+            <w:r>
+              <w:t xml:space="preserve"> </w:t>
+            </w:r>
+            <w:r>
+              <w:t xml:space="preserve">— and verified never to</w:t>
+            </w:r>
+            <w:r>
+              <w:t xml:space="preserve"> </w:t>
+            </w:r>
+            <w:r>
+              <w:t xml:space="preserve">contradict the dictionary’s own</w:t>
+            </w:r>
+            <w:r>
+              <w:t xml:space="preserve"> </w:t>
+            </w:r>
+            <w:r>
+              <w:t xml:space="preserve">attested pronunciations, which</w:t>
+            </w:r>
+            <w:r>
+              <w:t xml:space="preserve"> </w:t>
+            </w:r>
+            <w:r>
+              <w:t xml:space="preserve">are internally consistent at</w:t>
+            </w:r>
+            <w:r>
+              <w:t xml:space="preserve"> </w:t>
+            </w:r>
+            <w:r>
+              <w:t xml:space="preserve">every such juncture; and an</w:t>
+            </w:r>
+            <w:r>
+              <w:t xml:space="preserve"> </w:t>
+            </w:r>
+            <w:r>
+              <w:t xml:space="preserve">honorific (zhe sa) register whose</w:t>
+            </w:r>
+            <w:r>
+              <w:t xml:space="preserve"> </w:t>
+            </w:r>
+            <w:r>
+              <w:t xml:space="preserve">terms wear their badge, with the</w:t>
+            </w:r>
+            <w:r>
+              <w:t xml:space="preserve"> </w:t>
+            </w:r>
+            <w:r>
+              <w:t xml:space="preserve">ordinary word beside them, in</w:t>
+            </w:r>
+            <w:r>
+              <w:t xml:space="preserve"> </w:t>
+            </w:r>
+            <w:r>
+              <w:t xml:space="preserve">every pane of the application —</w:t>
+            </w:r>
+            <w:r>
+              <w:t xml:space="preserve"> </w:t>
+            </w:r>
+            <w:r>
+              <w:t xml:space="preserve">with a high-honorific level</w:t>
+            </w:r>
+            <w:r>
+              <w:t xml:space="preserve"> </w:t>
+            </w:r>
+            <w:r>
+              <w:t xml:space="preserve">awaiting his marking</w:t>
             </w:r>
           </w:p>
         </w:tc>

</xml_diff>